<commit_message>
Replace GINABO text with logo image in header and footer
</commit_message>
<xml_diff>
--- a/Prop Ginabo.docx
+++ b/Prop Ginabo.docx
@@ -2,9 +2,71 @@
 <file path=word/document.xml><?xml version="1.0" encoding="utf-8"?>
 <w:document xmlns:wpc="http://schemas.microsoft.com/office/word/2010/wordprocessingCanvas" xmlns:cx="http://schemas.microsoft.com/office/drawing/2014/chartex" xmlns:cx1="http://schemas.microsoft.com/office/drawing/2015/9/8/chartex" xmlns:cx2="http://schemas.microsoft.com/office/drawing/2015/10/21/chartex" xmlns:cx3="http://schemas.microsoft.com/office/drawing/2016/5/9/chartex" xmlns:cx4="http://schemas.microsoft.com/office/drawing/2016/5/10/chartex" xmlns:cx5="http://schemas.microsoft.com/office/drawing/2016/5/11/chartex" xmlns:cx6="http://schemas.microsoft.com/office/drawing/2016/5/12/chartex" xmlns:cx7="http://schemas.microsoft.com/office/drawing/2016/5/13/chartex" xmlns:cx8="http://schemas.microsoft.com/office/drawing/2016/5/14/chartex" xmlns:mc="http://schemas.openxmlformats.org/markup-compatibility/2006" xmlns:aink="http://schemas.microsoft.com/office/drawing/2016/ink" xmlns:am3d="http://schemas.microsoft.com/office/drawing/2017/model3d" xmlns:o="urn:schemas-microsoft-com:office:office" xmlns:oel="http://schemas.microsoft.com/office/2019/extlst" xmlns:r="http://schemas.openxmlformats.org/officeDocument/2006/relationships" xmlns:m="http://schemas.openxmlformats.org/officeDocument/2006/math" xmlns:v="urn:schemas-microsoft-com:vml" xmlns:wp14="http://schemas.microsoft.com/office/word/2010/wordprocessingDrawing" xmlns:wp="http://schemas.openxmlformats.org/drawingml/2006/wordprocessingDrawing" xmlns:w10="urn:schemas-microsoft-com:office:word" xmlns:w="http://schemas.openxmlformats.org/wordprocessingml/2006/main" xmlns:w14="http://schemas.microsoft.com/office/word/2010/wordml" xmlns:w15="http://schemas.microsoft.com/office/word/2012/wordml" xmlns:w16cex="http://schemas.microsoft.com/office/word/2018/wordml/cex" xmlns:w16cid="http://schemas.microsoft.com/office/word/2016/wordml/cid" xmlns:w16="http://schemas.microsoft.com/office/word/2018/wordml" xmlns:w16du="http://schemas.microsoft.com/office/word/2023/wordml/word16du" xmlns:w16sdtdh="http://schemas.microsoft.com/office/word/2020/wordml/sdtdatahash" xmlns:w16sdtfl="http://schemas.microsoft.com/office/word/2024/wordml/sdtformatlock" xmlns:w16se="http://schemas.microsoft.com/office/word/2015/wordml/symex" xmlns:wpg="http://schemas.microsoft.com/office/word/2010/wordprocessingGroup" xmlns:wpi="http://schemas.microsoft.com/office/word/2010/wordprocessingInk" xmlns:wne="http://schemas.microsoft.com/office/word/2006/wordml" xmlns:wps="http://schemas.microsoft.com/office/word/2010/wordprocessingShape" mc:Ignorable="w14 w15 w16se w16cid w16 w16cex w16sdtdh w16sdtfl w16du wp14">
   <w:body>
+    <w:tbl>
+      <w:tblPr>
+        <w:tblW w:w="9360" w:type="dxa"/>
+        <w:tblBorders>
+          <w:top w:val="single" w:sz="4" w:space="0" w:color="auto"/>
+          <w:left w:val="single" w:sz="4" w:space="0" w:color="auto"/>
+          <w:bottom w:val="single" w:sz="4" w:space="0" w:color="auto"/>
+          <w:right w:val="single" w:sz="4" w:space="0" w:color="auto"/>
+          <w:insideH w:val="single" w:sz="4" w:space="0" w:color="auto"/>
+          <w:insideV w:val="single" w:sz="4" w:space="0" w:color="auto"/>
+        </w:tblBorders>
+        <w:tblCellMar>
+          <w:left w:w="10" w:type="dxa"/>
+          <w:right w:w="10" w:type="dxa"/>
+        </w:tblCellMar>
+        <w:tblLook w:val="0000" w:firstRow="0" w:lastRow="0" w:firstColumn="0" w:lastColumn="0" w:noHBand="0" w:noVBand="0"/>
+      </w:tblPr>
+      <w:tblGrid>
+        <w:gridCol w:w="9360"/>
+      </w:tblGrid>
+      <w:tr>
+        <w:tc>
+          <w:tcPr>
+            <w:tcW w:w="0" w:type="auto"/>
+            <w:tcBorders>
+              <w:top w:val="single" w:sz="1" w:space="0" w:color="D1C4E9"/>
+              <w:left w:val="single" w:sz="1" w:space="0" w:color="D1C4E9"/>
+              <w:bottom w:val="single" w:sz="1" w:space="0" w:color="D1C4E9"/>
+              <w:right w:val="single" w:sz="1" w:space="0" w:color="D1C4E9"/>
+            </w:tcBorders>
+            <w:shd w:val="clear" w:color="auto" w:fill="5B2D8E"/>
+            <w:tcMar>
+              <w:top w:w="100" w:type="dxa"/>
+              <w:left w:w="160" w:type="dxa"/>
+              <w:bottom w:w="100" w:type="dxa"/>
+              <w:right w:w="160" w:type="dxa"/>
+            </w:tcMar>
+            <w:vAlign w:val="center"/>
+          </w:tcPr>
+          <w:p>
+            <w:pPr>
+              <w:spacing w:before="120" w:after="120"/>
+              <w:jc w:val="center"/>
+              <w:rPr>
+                <w:lang w:val="id-ID"/>
+              </w:rPr>
+            </w:pPr>
+            <w:r>
+              <w:rPr>
+                <w:b/>
+                <w:bCs/>
+                <w:color w:val="FFFFFF"/>
+                <w:sz w:val="28"/>
+                <w:szCs w:val="28"/>
+                <w:lang w:val="id-ID"/>
+              </w:rPr>
+              <w:t>PROPOSAL PENGEMBANGAN</w:t>
+            </w:r>
+          </w:p>
+        </w:tc>
+      </w:tr>
+    </w:tbl>
     <w:p>
       <w:pPr>
-        <w:spacing w:after="480"/>
+        <w:spacing w:after="60"/>
         <w:rPr>
           <w:lang w:val="id-ID"/>
         </w:rPr>
@@ -31,88 +93,6 @@
         <w:gridCol w:w="9360"/>
       </w:tblGrid>
       <w:tr>
-        <w:tblPrEx>
-          <w:tblCellMar>
-            <w:top w:w="0" w:type="dxa"/>
-            <w:bottom w:w="0" w:type="dxa"/>
-          </w:tblCellMar>
-        </w:tblPrEx>
-        <w:tc>
-          <w:tcPr>
-            <w:tcW w:w="0" w:type="auto"/>
-            <w:tcBorders>
-              <w:top w:val="single" w:sz="1" w:space="0" w:color="D1C4E9"/>
-              <w:left w:val="single" w:sz="1" w:space="0" w:color="D1C4E9"/>
-              <w:bottom w:val="single" w:sz="1" w:space="0" w:color="D1C4E9"/>
-              <w:right w:val="single" w:sz="1" w:space="0" w:color="D1C4E9"/>
-            </w:tcBorders>
-            <w:shd w:val="clear" w:color="auto" w:fill="5B2D8E"/>
-            <w:tcMar>
-              <w:top w:w="100" w:type="dxa"/>
-              <w:left w:w="160" w:type="dxa"/>
-              <w:bottom w:w="100" w:type="dxa"/>
-              <w:right w:w="160" w:type="dxa"/>
-            </w:tcMar>
-            <w:vAlign w:val="center"/>
-          </w:tcPr>
-          <w:p>
-            <w:pPr>
-              <w:spacing w:before="120" w:after="120"/>
-              <w:jc w:val="center"/>
-              <w:rPr>
-                <w:lang w:val="id-ID"/>
-              </w:rPr>
-            </w:pPr>
-            <w:r>
-              <w:rPr>
-                <w:b/>
-                <w:bCs/>
-                <w:color w:val="FFFFFF"/>
-                <w:sz w:val="28"/>
-                <w:szCs w:val="28"/>
-                <w:lang w:val="id-ID"/>
-              </w:rPr>
-              <w:t>PROPOSAL PENGEMBANGAN</w:t>
-            </w:r>
-          </w:p>
-        </w:tc>
-      </w:tr>
-    </w:tbl>
-    <w:p>
-      <w:pPr>
-        <w:spacing w:after="60"/>
-        <w:rPr>
-          <w:lang w:val="id-ID"/>
-        </w:rPr>
-      </w:pPr>
-    </w:p>
-    <w:tbl>
-      <w:tblPr>
-        <w:tblW w:w="9360" w:type="dxa"/>
-        <w:tblBorders>
-          <w:top w:val="single" w:sz="4" w:space="0" w:color="auto"/>
-          <w:left w:val="single" w:sz="4" w:space="0" w:color="auto"/>
-          <w:bottom w:val="single" w:sz="4" w:space="0" w:color="auto"/>
-          <w:right w:val="single" w:sz="4" w:space="0" w:color="auto"/>
-          <w:insideH w:val="single" w:sz="4" w:space="0" w:color="auto"/>
-          <w:insideV w:val="single" w:sz="4" w:space="0" w:color="auto"/>
-        </w:tblBorders>
-        <w:tblCellMar>
-          <w:left w:w="10" w:type="dxa"/>
-          <w:right w:w="10" w:type="dxa"/>
-        </w:tblCellMar>
-        <w:tblLook w:val="0000" w:firstRow="0" w:lastRow="0" w:firstColumn="0" w:lastColumn="0" w:noHBand="0" w:noVBand="0"/>
-      </w:tblPr>
-      <w:tblGrid>
-        <w:gridCol w:w="9360"/>
-      </w:tblGrid>
-      <w:tr>
-        <w:tblPrEx>
-          <w:tblCellMar>
-            <w:top w:w="0" w:type="dxa"/>
-            <w:bottom w:w="0" w:type="dxa"/>
-          </w:tblCellMar>
-        </w:tblPrEx>
         <w:tc>
           <w:tcPr>
             <w:tcW w:w="0" w:type="auto"/>
@@ -391,12 +371,6 @@
         <w:gridCol w:w="3442"/>
       </w:tblGrid>
       <w:tr>
-        <w:tblPrEx>
-          <w:tblCellMar>
-            <w:top w:w="0" w:type="dxa"/>
-            <w:bottom w:w="0" w:type="dxa"/>
-          </w:tblCellMar>
-        </w:tblPrEx>
         <w:tc>
           <w:tcPr>
             <w:tcW w:w="0" w:type="auto"/>
@@ -658,8 +632,9 @@
           <w:szCs w:val="20"/>
           <w:lang w:val="id-ID"/>
         </w:rPr>
-        <w:t>R</w:t>
-      </w:r>
+        <w:t>Raskop</w:t>
+      </w:r>
+      <w:proofErr w:type="spellEnd"/>
       <w:r>
         <w:rPr>
           <w:b/>
@@ -669,41 +644,7 @@
           <w:szCs w:val="20"/>
           <w:lang w:val="id-ID"/>
         </w:rPr>
-        <w:t>askop</w:t>
-      </w:r>
-      <w:proofErr w:type="spellEnd"/>
-      <w:r>
-        <w:rPr>
-          <w:b/>
-          <w:bCs/>
-          <w:color w:val="6B7280"/>
-          <w:sz w:val="20"/>
-          <w:szCs w:val="20"/>
-          <w:lang w:val="id-ID"/>
-        </w:rPr>
-        <w:t xml:space="preserve"> D</w:t>
-      </w:r>
-      <w:r>
-        <w:rPr>
-          <w:b/>
-          <w:bCs/>
-          <w:color w:val="6B7280"/>
-          <w:sz w:val="20"/>
-          <w:szCs w:val="20"/>
-          <w:lang w:val="id-ID"/>
-        </w:rPr>
-        <w:t>igital</w:t>
-      </w:r>
-      <w:r>
-        <w:rPr>
-          <w:b/>
-          <w:bCs/>
-          <w:color w:val="6B7280"/>
-          <w:sz w:val="20"/>
-          <w:szCs w:val="20"/>
-          <w:lang w:val="id-ID"/>
-        </w:rPr>
-        <w:t xml:space="preserve"> Studio</w:t>
+        <w:t xml:space="preserve"> Digital Studio</w:t>
       </w:r>
       <w:r>
         <w:rPr>
@@ -862,12 +803,6 @@
         <w:gridCol w:w="9360"/>
       </w:tblGrid>
       <w:tr>
-        <w:tblPrEx>
-          <w:tblCellMar>
-            <w:top w:w="0" w:type="dxa"/>
-            <w:bottom w:w="0" w:type="dxa"/>
-          </w:tblCellMar>
-        </w:tblPrEx>
         <w:tc>
           <w:tcPr>
             <w:tcW w:w="0" w:type="auto"/>
@@ -1743,12 +1678,6 @@
         <w:gridCol w:w="7020"/>
       </w:tblGrid>
       <w:tr>
-        <w:tblPrEx>
-          <w:tblCellMar>
-            <w:top w:w="0" w:type="dxa"/>
-            <w:bottom w:w="0" w:type="dxa"/>
-          </w:tblCellMar>
-        </w:tblPrEx>
         <w:tc>
           <w:tcPr>
             <w:tcW w:w="2340" w:type="dxa"/>
@@ -1868,12 +1797,6 @@
         </w:tc>
       </w:tr>
       <w:tr>
-        <w:tblPrEx>
-          <w:tblCellMar>
-            <w:top w:w="0" w:type="dxa"/>
-            <w:bottom w:w="0" w:type="dxa"/>
-          </w:tblCellMar>
-        </w:tblPrEx>
         <w:tc>
           <w:tcPr>
             <w:tcW w:w="2340" w:type="dxa"/>
@@ -1978,12 +1901,6 @@
         </w:tc>
       </w:tr>
       <w:tr>
-        <w:tblPrEx>
-          <w:tblCellMar>
-            <w:top w:w="0" w:type="dxa"/>
-            <w:bottom w:w="0" w:type="dxa"/>
-          </w:tblCellMar>
-        </w:tblPrEx>
         <w:tc>
           <w:tcPr>
             <w:tcW w:w="2340" w:type="dxa"/>
@@ -2172,12 +2089,6 @@
         </w:tc>
       </w:tr>
       <w:tr>
-        <w:tblPrEx>
-          <w:tblCellMar>
-            <w:top w:w="0" w:type="dxa"/>
-            <w:bottom w:w="0" w:type="dxa"/>
-          </w:tblCellMar>
-        </w:tblPrEx>
         <w:tc>
           <w:tcPr>
             <w:tcW w:w="2340" w:type="dxa"/>
@@ -3158,12 +3069,6 @@
         <w:gridCol w:w="9360"/>
       </w:tblGrid>
       <w:tr>
-        <w:tblPrEx>
-          <w:tblCellMar>
-            <w:top w:w="0" w:type="dxa"/>
-            <w:bottom w:w="0" w:type="dxa"/>
-          </w:tblCellMar>
-        </w:tblPrEx>
         <w:tc>
           <w:tcPr>
             <w:tcW w:w="0" w:type="auto"/>
@@ -3266,12 +3171,6 @@
         <w:gridCol w:w="4680"/>
       </w:tblGrid>
       <w:tr>
-        <w:tblPrEx>
-          <w:tblCellMar>
-            <w:top w:w="0" w:type="dxa"/>
-            <w:bottom w:w="0" w:type="dxa"/>
-          </w:tblCellMar>
-        </w:tblPrEx>
         <w:tc>
           <w:tcPr>
             <w:tcW w:w="4680" w:type="dxa"/>
@@ -3412,12 +3311,6 @@
         </w:tc>
       </w:tr>
       <w:tr>
-        <w:tblPrEx>
-          <w:tblCellMar>
-            <w:top w:w="0" w:type="dxa"/>
-            <w:bottom w:w="0" w:type="dxa"/>
-          </w:tblCellMar>
-        </w:tblPrEx>
         <w:tc>
           <w:tcPr>
             <w:tcW w:w="4680" w:type="dxa"/>
@@ -3641,12 +3534,6 @@
         </w:tc>
       </w:tr>
       <w:tr>
-        <w:tblPrEx>
-          <w:tblCellMar>
-            <w:top w:w="0" w:type="dxa"/>
-            <w:bottom w:w="0" w:type="dxa"/>
-          </w:tblCellMar>
-        </w:tblPrEx>
         <w:tc>
           <w:tcPr>
             <w:tcW w:w="4680" w:type="dxa"/>
@@ -3850,12 +3737,6 @@
         </w:tc>
       </w:tr>
       <w:tr>
-        <w:tblPrEx>
-          <w:tblCellMar>
-            <w:top w:w="0" w:type="dxa"/>
-            <w:bottom w:w="0" w:type="dxa"/>
-          </w:tblCellMar>
-        </w:tblPrEx>
         <w:tc>
           <w:tcPr>
             <w:tcW w:w="4680" w:type="dxa"/>
@@ -5612,12 +5493,6 @@
         <w:gridCol w:w="2063"/>
       </w:tblGrid>
       <w:tr>
-        <w:tblPrEx>
-          <w:tblCellMar>
-            <w:top w:w="0" w:type="dxa"/>
-            <w:bottom w:w="0" w:type="dxa"/>
-          </w:tblCellMar>
-        </w:tblPrEx>
         <w:tc>
           <w:tcPr>
             <w:tcW w:w="520" w:type="dxa"/>
@@ -5736,12 +5611,6 @@
         </w:tc>
       </w:tr>
       <w:tr>
-        <w:tblPrEx>
-          <w:tblCellMar>
-            <w:top w:w="0" w:type="dxa"/>
-            <w:bottom w:w="0" w:type="dxa"/>
-          </w:tblCellMar>
-        </w:tblPrEx>
         <w:tc>
           <w:tcPr>
             <w:tcW w:w="520" w:type="dxa"/>
@@ -5894,12 +5763,6 @@
         </w:tc>
       </w:tr>
       <w:tr>
-        <w:tblPrEx>
-          <w:tblCellMar>
-            <w:top w:w="0" w:type="dxa"/>
-            <w:bottom w:w="0" w:type="dxa"/>
-          </w:tblCellMar>
-        </w:tblPrEx>
         <w:tc>
           <w:tcPr>
             <w:tcW w:w="520" w:type="dxa"/>
@@ -6075,12 +5938,6 @@
         </w:tc>
       </w:tr>
       <w:tr>
-        <w:tblPrEx>
-          <w:tblCellMar>
-            <w:top w:w="0" w:type="dxa"/>
-            <w:bottom w:w="0" w:type="dxa"/>
-          </w:tblCellMar>
-        </w:tblPrEx>
         <w:tc>
           <w:tcPr>
             <w:tcW w:w="520" w:type="dxa"/>
@@ -6256,12 +6113,6 @@
         </w:tc>
       </w:tr>
       <w:tr>
-        <w:tblPrEx>
-          <w:tblCellMar>
-            <w:top w:w="0" w:type="dxa"/>
-            <w:bottom w:w="0" w:type="dxa"/>
-          </w:tblCellMar>
-        </w:tblPrEx>
         <w:tc>
           <w:tcPr>
             <w:tcW w:w="520" w:type="dxa"/>
@@ -6421,12 +6272,6 @@
         </w:tc>
       </w:tr>
       <w:tr>
-        <w:tblPrEx>
-          <w:tblCellMar>
-            <w:top w:w="0" w:type="dxa"/>
-            <w:bottom w:w="0" w:type="dxa"/>
-          </w:tblCellMar>
-        </w:tblPrEx>
         <w:tc>
           <w:tcPr>
             <w:tcW w:w="520" w:type="dxa"/>
@@ -6602,12 +6447,6 @@
         </w:tc>
       </w:tr>
       <w:tr>
-        <w:tblPrEx>
-          <w:tblCellMar>
-            <w:top w:w="0" w:type="dxa"/>
-            <w:bottom w:w="0" w:type="dxa"/>
-          </w:tblCellMar>
-        </w:tblPrEx>
         <w:tc>
           <w:tcPr>
             <w:tcW w:w="520" w:type="dxa"/>
@@ -6744,12 +6583,6 @@
         </w:tc>
       </w:tr>
       <w:tr>
-        <w:tblPrEx>
-          <w:tblCellMar>
-            <w:top w:w="0" w:type="dxa"/>
-            <w:bottom w:w="0" w:type="dxa"/>
-          </w:tblCellMar>
-        </w:tblPrEx>
         <w:tc>
           <w:tcPr>
             <w:tcW w:w="520" w:type="dxa"/>
@@ -6902,12 +6735,6 @@
         </w:tc>
       </w:tr>
       <w:tr>
-        <w:tblPrEx>
-          <w:tblCellMar>
-            <w:top w:w="0" w:type="dxa"/>
-            <w:bottom w:w="0" w:type="dxa"/>
-          </w:tblCellMar>
-        </w:tblPrEx>
         <w:tc>
           <w:tcPr>
             <w:tcW w:w="520" w:type="dxa"/>
@@ -7019,12 +6846,6 @@
         </w:tc>
       </w:tr>
       <w:tr>
-        <w:tblPrEx>
-          <w:tblCellMar>
-            <w:top w:w="0" w:type="dxa"/>
-            <w:bottom w:w="0" w:type="dxa"/>
-          </w:tblCellMar>
-        </w:tblPrEx>
         <w:tc>
           <w:tcPr>
             <w:tcW w:w="520" w:type="dxa"/>
@@ -7145,12 +6966,6 @@
         </w:tc>
       </w:tr>
       <w:tr>
-        <w:tblPrEx>
-          <w:tblCellMar>
-            <w:top w:w="0" w:type="dxa"/>
-            <w:bottom w:w="0" w:type="dxa"/>
-          </w:tblCellMar>
-        </w:tblPrEx>
         <w:tc>
           <w:tcPr>
             <w:tcW w:w="520" w:type="dxa"/>
@@ -7398,12 +7213,6 @@
         <w:gridCol w:w="4680"/>
       </w:tblGrid>
       <w:tr>
-        <w:tblPrEx>
-          <w:tblCellMar>
-            <w:top w:w="0" w:type="dxa"/>
-            <w:bottom w:w="0" w:type="dxa"/>
-          </w:tblCellMar>
-        </w:tblPrEx>
         <w:tc>
           <w:tcPr>
             <w:tcW w:w="1560" w:type="dxa"/>
@@ -7520,12 +7329,6 @@
         </w:tc>
       </w:tr>
       <w:tr>
-        <w:tblPrEx>
-          <w:tblCellMar>
-            <w:top w:w="0" w:type="dxa"/>
-            <w:bottom w:w="0" w:type="dxa"/>
-          </w:tblCellMar>
-        </w:tblPrEx>
         <w:tc>
           <w:tcPr>
             <w:tcW w:w="1560" w:type="dxa"/>
@@ -7761,12 +7564,6 @@
         </w:tc>
       </w:tr>
       <w:tr>
-        <w:tblPrEx>
-          <w:tblCellMar>
-            <w:top w:w="0" w:type="dxa"/>
-            <w:bottom w:w="0" w:type="dxa"/>
-          </w:tblCellMar>
-        </w:tblPrEx>
         <w:tc>
           <w:tcPr>
             <w:tcW w:w="1560" w:type="dxa"/>
@@ -7923,12 +7720,6 @@
         </w:tc>
       </w:tr>
       <w:tr>
-        <w:tblPrEx>
-          <w:tblCellMar>
-            <w:top w:w="0" w:type="dxa"/>
-            <w:bottom w:w="0" w:type="dxa"/>
-          </w:tblCellMar>
-        </w:tblPrEx>
         <w:tc>
           <w:tcPr>
             <w:tcW w:w="1560" w:type="dxa"/>
@@ -8126,12 +7917,6 @@
         </w:tc>
       </w:tr>
       <w:tr>
-        <w:tblPrEx>
-          <w:tblCellMar>
-            <w:top w:w="0" w:type="dxa"/>
-            <w:bottom w:w="0" w:type="dxa"/>
-          </w:tblCellMar>
-        </w:tblPrEx>
         <w:tc>
           <w:tcPr>
             <w:tcW w:w="1560" w:type="dxa"/>
@@ -8336,26 +8121,15 @@
           <w:bottom w:val="single" w:sz="8" w:space="4" w:color="5B2D8E"/>
         </w:pBdr>
         <w:rPr>
+          <w:lang w:val="id-ID"/>
+        </w:rPr>
+      </w:pPr>
+      <w:r>
+        <w:rPr>
           <w:color w:val="5B2D8E"/>
           <w:lang w:val="id-ID"/>
         </w:rPr>
-      </w:pPr>
-    </w:p>
-    <w:p>
-      <w:pPr>
-        <w:pStyle w:val="Heading1"/>
-        <w:pBdr>
-          <w:bottom w:val="single" w:sz="8" w:space="4" w:color="5B2D8E"/>
-        </w:pBdr>
-        <w:rPr>
-          <w:lang w:val="id-ID"/>
-        </w:rPr>
-      </w:pPr>
-      <w:r>
-        <w:rPr>
-          <w:color w:val="5B2D8E"/>
-          <w:lang w:val="id-ID"/>
-        </w:rPr>
+        <w:lastRenderedPageBreak/>
         <w:t>06. INVESTASI</w:t>
       </w:r>
     </w:p>
@@ -8380,12 +8154,6 @@
         <w:gridCol w:w="9360"/>
       </w:tblGrid>
       <w:tr>
-        <w:tblPrEx>
-          <w:tblCellMar>
-            <w:top w:w="0" w:type="dxa"/>
-            <w:bottom w:w="0" w:type="dxa"/>
-          </w:tblCellMar>
-        </w:tblPrEx>
         <w:tc>
           <w:tcPr>
             <w:tcW w:w="0" w:type="auto"/>
@@ -8588,12 +8356,6 @@
         <w:gridCol w:w="4680"/>
       </w:tblGrid>
       <w:tr>
-        <w:tblPrEx>
-          <w:tblCellMar>
-            <w:top w:w="0" w:type="dxa"/>
-            <w:bottom w:w="0" w:type="dxa"/>
-          </w:tblCellMar>
-        </w:tblPrEx>
         <w:tc>
           <w:tcPr>
             <w:tcW w:w="4680" w:type="dxa"/>
@@ -9315,12 +9077,6 @@
         <w:gridCol w:w="3120"/>
       </w:tblGrid>
       <w:tr>
-        <w:tblPrEx>
-          <w:tblCellMar>
-            <w:top w:w="0" w:type="dxa"/>
-            <w:bottom w:w="0" w:type="dxa"/>
-          </w:tblCellMar>
-        </w:tblPrEx>
         <w:tc>
           <w:tcPr>
             <w:tcW w:w="3120" w:type="dxa"/>
@@ -9710,12 +9466,6 @@
         <w:gridCol w:w="9360"/>
       </w:tblGrid>
       <w:tr>
-        <w:tblPrEx>
-          <w:tblCellMar>
-            <w:top w:w="0" w:type="dxa"/>
-            <w:bottom w:w="0" w:type="dxa"/>
-          </w:tblCellMar>
-        </w:tblPrEx>
         <w:tc>
           <w:tcPr>
             <w:tcW w:w="0" w:type="auto"/>
@@ -10003,17 +9753,7 @@
           <w:szCs w:val="32"/>
         </w:rPr>
         <w:lastRenderedPageBreak/>
-        <w:t>08. L</w:t>
-      </w:r>
-      <w:r>
-        <w:rPr>
-          <w:b/>
-          <w:bCs/>
-          <w:color w:val="5B2D8E"/>
-          <w:sz w:val="32"/>
-          <w:szCs w:val="32"/>
-        </w:rPr>
-        <w:t>AMPIRAN — LAPORAN PROGRES PENGEMBANGAN</w:t>
+        <w:t>08. LAMPIRAN — LAPORAN PROGRES PENGEMBANGAN</w:t>
       </w:r>
     </w:p>
     <w:tbl>
@@ -10037,12 +9777,6 @@
         <w:gridCol w:w="9026"/>
       </w:tblGrid>
       <w:tr>
-        <w:tblPrEx>
-          <w:tblCellMar>
-            <w:top w:w="0" w:type="dxa"/>
-            <w:bottom w:w="0" w:type="dxa"/>
-          </w:tblCellMar>
-        </w:tblPrEx>
         <w:tc>
           <w:tcPr>
             <w:tcW w:w="0" w:type="auto"/>
@@ -10371,12 +10105,6 @@
         <w:gridCol w:w="2257"/>
       </w:tblGrid>
       <w:tr>
-        <w:tblPrEx>
-          <w:tblCellMar>
-            <w:top w:w="0" w:type="dxa"/>
-            <w:bottom w:w="0" w:type="dxa"/>
-          </w:tblCellMar>
-        </w:tblPrEx>
         <w:tc>
           <w:tcPr>
             <w:tcW w:w="2256" w:type="dxa"/>
@@ -10619,12 +10347,6 @@
         <w:gridCol w:w="4814"/>
       </w:tblGrid>
       <w:tr>
-        <w:tblPrEx>
-          <w:tblCellMar>
-            <w:top w:w="0" w:type="dxa"/>
-            <w:bottom w:w="0" w:type="dxa"/>
-          </w:tblCellMar>
-        </w:tblPrEx>
         <w:tc>
           <w:tcPr>
             <w:tcW w:w="2406" w:type="dxa"/>
@@ -10731,12 +10453,6 @@
         </w:tc>
       </w:tr>
       <w:tr>
-        <w:tblPrEx>
-          <w:tblCellMar>
-            <w:top w:w="0" w:type="dxa"/>
-            <w:bottom w:w="0" w:type="dxa"/>
-          </w:tblCellMar>
-        </w:tblPrEx>
         <w:tc>
           <w:tcPr>
             <w:tcW w:w="2406" w:type="dxa"/>
@@ -10994,12 +10710,6 @@
         </w:tc>
       </w:tr>
       <w:tr>
-        <w:tblPrEx>
-          <w:tblCellMar>
-            <w:top w:w="0" w:type="dxa"/>
-            <w:bottom w:w="0" w:type="dxa"/>
-          </w:tblCellMar>
-        </w:tblPrEx>
         <w:tc>
           <w:tcPr>
             <w:tcW w:w="2406" w:type="dxa"/>
@@ -11381,12 +11091,6 @@
         </w:tc>
       </w:tr>
       <w:tr>
-        <w:tblPrEx>
-          <w:tblCellMar>
-            <w:top w:w="0" w:type="dxa"/>
-            <w:bottom w:w="0" w:type="dxa"/>
-          </w:tblCellMar>
-        </w:tblPrEx>
         <w:tc>
           <w:tcPr>
             <w:tcW w:w="2406" w:type="dxa"/>
@@ -11674,12 +11378,6 @@
         </w:tc>
       </w:tr>
       <w:tr>
-        <w:tblPrEx>
-          <w:tblCellMar>
-            <w:top w:w="0" w:type="dxa"/>
-            <w:bottom w:w="0" w:type="dxa"/>
-          </w:tblCellMar>
-        </w:tblPrEx>
         <w:tc>
           <w:tcPr>
             <w:tcW w:w="2406" w:type="dxa"/>
@@ -11953,12 +11651,6 @@
         </w:tc>
       </w:tr>
       <w:tr>
-        <w:tblPrEx>
-          <w:tblCellMar>
-            <w:top w:w="0" w:type="dxa"/>
-            <w:bottom w:w="0" w:type="dxa"/>
-          </w:tblCellMar>
-        </w:tblPrEx>
         <w:tc>
           <w:tcPr>
             <w:tcW w:w="2406" w:type="dxa"/>
@@ -12180,12 +11872,6 @@
         </w:tc>
       </w:tr>
       <w:tr>
-        <w:tblPrEx>
-          <w:tblCellMar>
-            <w:top w:w="0" w:type="dxa"/>
-            <w:bottom w:w="0" w:type="dxa"/>
-          </w:tblCellMar>
-        </w:tblPrEx>
         <w:tc>
           <w:tcPr>
             <w:tcW w:w="2406" w:type="dxa"/>
@@ -12447,12 +12133,6 @@
         </w:tc>
       </w:tr>
       <w:tr>
-        <w:tblPrEx>
-          <w:tblCellMar>
-            <w:top w:w="0" w:type="dxa"/>
-            <w:bottom w:w="0" w:type="dxa"/>
-          </w:tblCellMar>
-        </w:tblPrEx>
         <w:tc>
           <w:tcPr>
             <w:tcW w:w="2406" w:type="dxa"/>
@@ -12748,12 +12428,6 @@
         <w:gridCol w:w="4814"/>
       </w:tblGrid>
       <w:tr>
-        <w:tblPrEx>
-          <w:tblCellMar>
-            <w:top w:w="0" w:type="dxa"/>
-            <w:bottom w:w="0" w:type="dxa"/>
-          </w:tblCellMar>
-        </w:tblPrEx>
         <w:tc>
           <w:tcPr>
             <w:tcW w:w="2406" w:type="dxa"/>
@@ -12860,12 +12534,6 @@
         </w:tc>
       </w:tr>
       <w:tr>
-        <w:tblPrEx>
-          <w:tblCellMar>
-            <w:top w:w="0" w:type="dxa"/>
-            <w:bottom w:w="0" w:type="dxa"/>
-          </w:tblCellMar>
-        </w:tblPrEx>
         <w:tc>
           <w:tcPr>
             <w:tcW w:w="2406" w:type="dxa"/>
@@ -13079,12 +12747,6 @@
         </w:tc>
       </w:tr>
       <w:tr>
-        <w:tblPrEx>
-          <w:tblCellMar>
-            <w:top w:w="0" w:type="dxa"/>
-            <w:bottom w:w="0" w:type="dxa"/>
-          </w:tblCellMar>
-        </w:tblPrEx>
         <w:tc>
           <w:tcPr>
             <w:tcW w:w="2406" w:type="dxa"/>
@@ -13280,12 +12942,6 @@
         </w:tc>
       </w:tr>
       <w:tr>
-        <w:tblPrEx>
-          <w:tblCellMar>
-            <w:top w:w="0" w:type="dxa"/>
-            <w:bottom w:w="0" w:type="dxa"/>
-          </w:tblCellMar>
-        </w:tblPrEx>
         <w:tc>
           <w:tcPr>
             <w:tcW w:w="2406" w:type="dxa"/>
@@ -13533,12 +13189,6 @@
         </w:tc>
       </w:tr>
       <w:tr>
-        <w:tblPrEx>
-          <w:tblCellMar>
-            <w:top w:w="0" w:type="dxa"/>
-            <w:bottom w:w="0" w:type="dxa"/>
-          </w:tblCellMar>
-        </w:tblPrEx>
         <w:tc>
           <w:tcPr>
             <w:tcW w:w="2406" w:type="dxa"/>
@@ -13764,12 +13414,6 @@
         </w:tc>
       </w:tr>
       <w:tr>
-        <w:tblPrEx>
-          <w:tblCellMar>
-            <w:top w:w="0" w:type="dxa"/>
-            <w:bottom w:w="0" w:type="dxa"/>
-          </w:tblCellMar>
-        </w:tblPrEx>
         <w:tc>
           <w:tcPr>
             <w:tcW w:w="2406" w:type="dxa"/>
@@ -14003,12 +13647,6 @@
         </w:tc>
       </w:tr>
       <w:tr>
-        <w:tblPrEx>
-          <w:tblCellMar>
-            <w:top w:w="0" w:type="dxa"/>
-            <w:bottom w:w="0" w:type="dxa"/>
-          </w:tblCellMar>
-        </w:tblPrEx>
         <w:tc>
           <w:tcPr>
             <w:tcW w:w="2406" w:type="dxa"/>
@@ -14252,12 +13890,6 @@
         </w:tc>
       </w:tr>
       <w:tr>
-        <w:tblPrEx>
-          <w:tblCellMar>
-            <w:top w:w="0" w:type="dxa"/>
-            <w:bottom w:w="0" w:type="dxa"/>
-          </w:tblCellMar>
-        </w:tblPrEx>
         <w:tc>
           <w:tcPr>
             <w:tcW w:w="2406" w:type="dxa"/>
@@ -14500,12 +14132,6 @@
         <w:gridCol w:w="4514"/>
       </w:tblGrid>
       <w:tr>
-        <w:tblPrEx>
-          <w:tblCellMar>
-            <w:top w:w="0" w:type="dxa"/>
-            <w:bottom w:w="0" w:type="dxa"/>
-          </w:tblCellMar>
-        </w:tblPrEx>
         <w:tc>
           <w:tcPr>
             <w:tcW w:w="2706" w:type="dxa"/>
@@ -14622,12 +14248,6 @@
         </w:tc>
       </w:tr>
       <w:tr>
-        <w:tblPrEx>
-          <w:tblCellMar>
-            <w:top w:w="0" w:type="dxa"/>
-            <w:bottom w:w="0" w:type="dxa"/>
-          </w:tblCellMar>
-        </w:tblPrEx>
         <w:tc>
           <w:tcPr>
             <w:tcW w:w="2706" w:type="dxa"/>
@@ -14813,12 +14433,6 @@
         </w:tc>
       </w:tr>
       <w:tr>
-        <w:tblPrEx>
-          <w:tblCellMar>
-            <w:top w:w="0" w:type="dxa"/>
-            <w:bottom w:w="0" w:type="dxa"/>
-          </w:tblCellMar>
-        </w:tblPrEx>
         <w:tc>
           <w:tcPr>
             <w:tcW w:w="2706" w:type="dxa"/>
@@ -15022,12 +14636,6 @@
         </w:tc>
       </w:tr>
       <w:tr>
-        <w:tblPrEx>
-          <w:tblCellMar>
-            <w:top w:w="0" w:type="dxa"/>
-            <w:bottom w:w="0" w:type="dxa"/>
-          </w:tblCellMar>
-        </w:tblPrEx>
         <w:tc>
           <w:tcPr>
             <w:tcW w:w="2706" w:type="dxa"/>
@@ -15285,12 +14893,6 @@
         </w:tc>
       </w:tr>
       <w:tr>
-        <w:tblPrEx>
-          <w:tblCellMar>
-            <w:top w:w="0" w:type="dxa"/>
-            <w:bottom w:w="0" w:type="dxa"/>
-          </w:tblCellMar>
-        </w:tblPrEx>
         <w:tc>
           <w:tcPr>
             <w:tcW w:w="2706" w:type="dxa"/>
@@ -15740,12 +15342,6 @@
         <w:gridCol w:w="4514"/>
       </w:tblGrid>
       <w:tr>
-        <w:tblPrEx>
-          <w:tblCellMar>
-            <w:top w:w="0" w:type="dxa"/>
-            <w:bottom w:w="0" w:type="dxa"/>
-          </w:tblCellMar>
-        </w:tblPrEx>
         <w:tc>
           <w:tcPr>
             <w:tcW w:w="2706" w:type="dxa"/>
@@ -15874,12 +15470,6 @@
         </w:tc>
       </w:tr>
       <w:tr>
-        <w:tblPrEx>
-          <w:tblCellMar>
-            <w:top w:w="0" w:type="dxa"/>
-            <w:bottom w:w="0" w:type="dxa"/>
-          </w:tblCellMar>
-        </w:tblPrEx>
         <w:tc>
           <w:tcPr>
             <w:tcW w:w="2706" w:type="dxa"/>
@@ -16067,12 +15657,6 @@
         </w:tc>
       </w:tr>
       <w:tr>
-        <w:tblPrEx>
-          <w:tblCellMar>
-            <w:top w:w="0" w:type="dxa"/>
-            <w:bottom w:w="0" w:type="dxa"/>
-          </w:tblCellMar>
-        </w:tblPrEx>
         <w:tc>
           <w:tcPr>
             <w:tcW w:w="2706" w:type="dxa"/>
@@ -16198,12 +15782,6 @@
         </w:tc>
       </w:tr>
       <w:tr>
-        <w:tblPrEx>
-          <w:tblCellMar>
-            <w:top w:w="0" w:type="dxa"/>
-            <w:bottom w:w="0" w:type="dxa"/>
-          </w:tblCellMar>
-        </w:tblPrEx>
         <w:tc>
           <w:tcPr>
             <w:tcW w:w="2706" w:type="dxa"/>
@@ -16373,12 +15951,6 @@
         <w:gridCol w:w="9026"/>
       </w:tblGrid>
       <w:tr>
-        <w:tblPrEx>
-          <w:tblCellMar>
-            <w:top w:w="0" w:type="dxa"/>
-            <w:bottom w:w="0" w:type="dxa"/>
-          </w:tblCellMar>
-        </w:tblPrEx>
         <w:tc>
           <w:tcPr>
             <w:tcW w:w="0" w:type="auto"/>
@@ -17301,6 +16873,10 @@
       <w:pPr>
         <w:spacing w:before="40" w:after="40"/>
         <w:jc w:val="center"/>
+        <w:rPr>
+          <w:color w:val="5B2D8E"/>
+          <w:lang w:val="id-ID"/>
+        </w:rPr>
       </w:pPr>
       <w:proofErr w:type="spellStart"/>
       <w:r>
@@ -17481,13 +17057,6 @@
     </w:p>
     <w:p>
       <w:pPr>
-        <w:rPr>
-          <w:lang w:val="id-ID"/>
-        </w:rPr>
-      </w:pPr>
-    </w:p>
-    <w:p>
-      <w:pPr>
         <w:pStyle w:val="Heading1"/>
         <w:pBdr>
           <w:bottom w:val="single" w:sz="8" w:space="4" w:color="5B2D8E"/>
@@ -17577,26 +17146,15 @@
           <w:bottom w:val="single" w:sz="8" w:space="4" w:color="5B2D8E"/>
         </w:pBdr>
         <w:rPr>
+          <w:lang w:val="id-ID"/>
+        </w:rPr>
+      </w:pPr>
+      <w:r>
+        <w:rPr>
           <w:color w:val="5B2D8E"/>
           <w:lang w:val="id-ID"/>
         </w:rPr>
-      </w:pPr>
-    </w:p>
-    <w:p>
-      <w:pPr>
-        <w:pStyle w:val="Heading1"/>
-        <w:pBdr>
-          <w:bottom w:val="single" w:sz="8" w:space="4" w:color="5B2D8E"/>
-        </w:pBdr>
-        <w:rPr>
-          <w:lang w:val="id-ID"/>
-        </w:rPr>
-      </w:pPr>
-      <w:r>
-        <w:rPr>
-          <w:color w:val="5B2D8E"/>
-          <w:lang w:val="id-ID"/>
-        </w:rPr>
+        <w:lastRenderedPageBreak/>
         <w:t>0</w:t>
       </w:r>
       <w:r>
@@ -17635,12 +17193,6 @@
         <w:gridCol w:w="9360"/>
       </w:tblGrid>
       <w:tr>
-        <w:tblPrEx>
-          <w:tblCellMar>
-            <w:top w:w="0" w:type="dxa"/>
-            <w:bottom w:w="0" w:type="dxa"/>
-          </w:tblCellMar>
-        </w:tblPrEx>
         <w:tc>
           <w:tcPr>
             <w:tcW w:w="0" w:type="auto"/>
@@ -17871,12 +17423,6 @@
         <w:gridCol w:w="4680"/>
       </w:tblGrid>
       <w:tr>
-        <w:tblPrEx>
-          <w:tblCellMar>
-            <w:top w:w="0" w:type="dxa"/>
-            <w:bottom w:w="0" w:type="dxa"/>
-          </w:tblCellMar>
-        </w:tblPrEx>
         <w:tc>
           <w:tcPr>
             <w:tcW w:w="4680" w:type="dxa"/>
@@ -18221,14 +17767,15 @@
         <w:spacing w:after="40"/>
         <w:jc w:val="center"/>
         <w:rPr>
-          <w:lang w:val="id-ID"/>
-        </w:rPr>
-      </w:pPr>
-      <w:r>
-        <w:rPr>
           <w:color w:val="6B7280"/>
           <w:lang w:val="id-ID"/>
         </w:rPr>
+      </w:pPr>
+      <w:r>
+        <w:rPr>
+          <w:color w:val="6B7280"/>
+          <w:lang w:val="id-ID"/>
+        </w:rPr>
         <w:t xml:space="preserve">— Tim </w:t>
       </w:r>
       <w:proofErr w:type="spellStart"/>
@@ -18246,6 +17793,243 @@
           <w:lang w:val="id-ID"/>
         </w:rPr>
         <w:t xml:space="preserve"> Digital —</w:t>
+      </w:r>
+    </w:p>
+    <w:p>
+      <w:pPr>
+        <w:spacing w:after="40"/>
+        <w:jc w:val="center"/>
+        <w:rPr>
+          <w:color w:val="6B7280"/>
+          <w:lang w:val="id-ID"/>
+        </w:rPr>
+      </w:pPr>
+    </w:p>
+    <w:p>
+      <w:pPr>
+        <w:spacing w:after="40"/>
+        <w:jc w:val="center"/>
+        <w:rPr>
+          <w:color w:val="6B7280"/>
+          <w:lang w:val="id-ID"/>
+        </w:rPr>
+      </w:pPr>
+    </w:p>
+    <w:p>
+      <w:pPr>
+        <w:spacing w:after="40"/>
+        <w:jc w:val="center"/>
+        <w:rPr>
+          <w:color w:val="6B7280"/>
+          <w:lang w:val="id-ID"/>
+        </w:rPr>
+      </w:pPr>
+    </w:p>
+    <w:p>
+      <w:pPr>
+        <w:spacing w:after="40"/>
+        <w:rPr>
+          <w:color w:val="6B7280"/>
+          <w:lang w:val="id-ID"/>
+        </w:rPr>
+      </w:pPr>
+    </w:p>
+    <w:p>
+      <w:pPr>
+        <w:spacing w:after="40"/>
+        <w:rPr>
+          <w:color w:val="6B7280"/>
+          <w:lang w:val="id-ID"/>
+        </w:rPr>
+      </w:pPr>
+    </w:p>
+    <w:p>
+      <w:pPr>
+        <w:spacing w:after="40"/>
+        <w:rPr>
+          <w:color w:val="6B7280"/>
+          <w:lang w:val="id-ID"/>
+        </w:rPr>
+      </w:pPr>
+    </w:p>
+    <w:p>
+      <w:pPr>
+        <w:spacing w:after="40"/>
+        <w:rPr>
+          <w:color w:val="6B7280"/>
+          <w:lang w:val="id-ID"/>
+        </w:rPr>
+      </w:pPr>
+    </w:p>
+    <w:p>
+      <w:pPr>
+        <w:spacing w:after="40"/>
+        <w:rPr>
+          <w:color w:val="6B7280"/>
+          <w:lang w:val="id-ID"/>
+        </w:rPr>
+      </w:pPr>
+    </w:p>
+    <w:p>
+      <w:pPr>
+        <w:spacing w:after="40"/>
+        <w:rPr>
+          <w:color w:val="6B7280"/>
+          <w:lang w:val="id-ID"/>
+        </w:rPr>
+      </w:pPr>
+    </w:p>
+    <w:p>
+      <w:pPr>
+        <w:spacing w:after="40"/>
+        <w:rPr>
+          <w:color w:val="6B7280"/>
+          <w:lang w:val="id-ID"/>
+        </w:rPr>
+      </w:pPr>
+    </w:p>
+    <w:p>
+      <w:pPr>
+        <w:spacing w:after="40"/>
+        <w:rPr>
+          <w:color w:val="6B7280"/>
+          <w:lang w:val="id-ID"/>
+        </w:rPr>
+      </w:pPr>
+    </w:p>
+    <w:p>
+      <w:pPr>
+        <w:spacing w:after="40"/>
+        <w:rPr>
+          <w:color w:val="6B7280"/>
+          <w:lang w:val="id-ID"/>
+        </w:rPr>
+      </w:pPr>
+    </w:p>
+    <w:p>
+      <w:pPr>
+        <w:spacing w:after="40"/>
+        <w:rPr>
+          <w:color w:val="6B7280"/>
+          <w:lang w:val="id-ID"/>
+        </w:rPr>
+      </w:pPr>
+    </w:p>
+    <w:p>
+      <w:pPr>
+        <w:spacing w:after="40"/>
+        <w:rPr>
+          <w:color w:val="6B7280"/>
+          <w:lang w:val="id-ID"/>
+        </w:rPr>
+      </w:pPr>
+    </w:p>
+    <w:p>
+      <w:pPr>
+        <w:spacing w:after="40"/>
+        <w:rPr>
+          <w:color w:val="6B7280"/>
+          <w:lang w:val="id-ID"/>
+        </w:rPr>
+      </w:pPr>
+    </w:p>
+    <w:p>
+      <w:pPr>
+        <w:spacing w:after="40"/>
+        <w:rPr>
+          <w:color w:val="6B7280"/>
+          <w:lang w:val="id-ID"/>
+        </w:rPr>
+      </w:pPr>
+    </w:p>
+    <w:p>
+      <w:pPr>
+        <w:spacing w:after="40"/>
+        <w:rPr>
+          <w:color w:val="6B7280"/>
+          <w:lang w:val="id-ID"/>
+        </w:rPr>
+      </w:pPr>
+    </w:p>
+    <w:p>
+      <w:pPr>
+        <w:spacing w:after="40"/>
+        <w:rPr>
+          <w:color w:val="6B7280"/>
+          <w:lang w:val="id-ID"/>
+        </w:rPr>
+      </w:pPr>
+    </w:p>
+    <w:p>
+      <w:pPr>
+        <w:spacing w:after="40"/>
+        <w:rPr>
+          <w:lang w:val="id-ID"/>
+        </w:rPr>
+      </w:pPr>
+      <w:r>
+        <w:rPr>
+          <w:color w:val="6B7280"/>
+          <w:lang w:val="id-ID"/>
+        </w:rPr>
+        <w:t>Lampiran :</w:t>
+      </w:r>
+      <w:r>
+        <w:rPr>
+          <w:color w:val="6B7280"/>
+          <w:lang w:val="id-ID"/>
+        </w:rPr>
+        <w:br/>
+        <w:t xml:space="preserve">1 set Contoh </w:t>
+      </w:r>
+      <w:proofErr w:type="spellStart"/>
+      <w:r>
+        <w:rPr>
+          <w:color w:val="6B7280"/>
+          <w:lang w:val="id-ID"/>
+        </w:rPr>
+        <w:t>Landpage</w:t>
+      </w:r>
+      <w:proofErr w:type="spellEnd"/>
+      <w:r>
+        <w:rPr>
+          <w:color w:val="6B7280"/>
+          <w:lang w:val="id-ID"/>
+        </w:rPr>
+        <w:br/>
+        <w:t xml:space="preserve">1 Set Contoh </w:t>
+      </w:r>
+      <w:proofErr w:type="spellStart"/>
+      <w:r>
+        <w:rPr>
+          <w:color w:val="6B7280"/>
+          <w:lang w:val="id-ID"/>
+        </w:rPr>
+        <w:t>Product</w:t>
+      </w:r>
+      <w:proofErr w:type="spellEnd"/>
+      <w:r>
+        <w:rPr>
+          <w:color w:val="6B7280"/>
+          <w:lang w:val="id-ID"/>
+        </w:rPr>
+        <w:t xml:space="preserve"> ( </w:t>
+      </w:r>
+      <w:proofErr w:type="spellStart"/>
+      <w:r>
+        <w:rPr>
+          <w:color w:val="6B7280"/>
+          <w:lang w:val="id-ID"/>
+        </w:rPr>
+        <w:t>Cataloq</w:t>
+      </w:r>
+      <w:proofErr w:type="spellEnd"/>
+      <w:r>
+        <w:rPr>
+          <w:color w:val="6B7280"/>
+          <w:lang w:val="id-ID"/>
+        </w:rPr>
+        <w:t xml:space="preserve"> )</w:t>
       </w:r>
     </w:p>
     <w:sectPr>
@@ -18295,23 +18079,7 @@
         <w:sz w:val="17"/>
         <w:szCs w:val="17"/>
       </w:rPr>
-      <w:t>R</w:t>
-    </w:r>
-    <w:r>
-      <w:rPr>
-        <w:color w:val="6B7280"/>
-        <w:sz w:val="17"/>
-        <w:szCs w:val="17"/>
-      </w:rPr>
-      <w:t>askop</w:t>
-    </w:r>
-    <w:r>
-      <w:rPr>
-        <w:color w:val="6B7280"/>
-        <w:sz w:val="17"/>
-        <w:szCs w:val="17"/>
-      </w:rPr>
-      <w:t xml:space="preserve"> </w:t>
+      <w:t xml:space="preserve">Raskop </w:t>
     </w:r>
     <w:proofErr w:type="spellStart"/>
     <w:r>
@@ -18320,15 +18088,7 @@
         <w:sz w:val="17"/>
         <w:szCs w:val="17"/>
       </w:rPr>
-      <w:t>D</w:t>
-    </w:r>
-    <w:r>
-      <w:rPr>
-        <w:color w:val="6B7280"/>
-        <w:sz w:val="17"/>
-        <w:szCs w:val="17"/>
-      </w:rPr>
-      <w:t>gital</w:t>
+      <w:t>Dgital</w:t>
     </w:r>
     <w:proofErr w:type="spellEnd"/>
     <w:r>
@@ -18346,16 +18106,7 @@
         <w:sz w:val="17"/>
         <w:szCs w:val="17"/>
       </w:rPr>
-      <w:t>|</w:t>
-    </w:r>
-    <w:proofErr w:type="gramEnd"/>
-    <w:r>
-      <w:rPr>
-        <w:color w:val="6B7280"/>
-        <w:sz w:val="17"/>
-        <w:szCs w:val="17"/>
-      </w:rPr>
-      <w:t xml:space="preserve">  </w:t>
+      <w:t xml:space="preserve">|  </w:t>
     </w:r>
     <w:proofErr w:type="spellStart"/>
     <w:r>
@@ -18367,6 +18118,7 @@
       <w:t>Dokumen</w:t>
     </w:r>
     <w:proofErr w:type="spellEnd"/>
+    <w:proofErr w:type="gramEnd"/>
     <w:r>
       <w:rPr>
         <w:color w:val="6B7280"/>

</xml_diff>